<commit_message>
refactor: remove excluded public workforce scope
</commit_message>
<xml_diff>
--- a/docs/企业工作站使用说明.docx
+++ b/docs/企业工作站使用说明.docx
@@ -14,7 +14,7 @@
           <w:color w:val="2E74B5"/>
           <w:sz w:val="22"/>
         </w:rPr>
-        <w:t>操作手册  ·  最终本地交付版</w:t>
+        <w:t>操作手册  ·  商业候选版</w:t>
       </w:r>
     </w:p>
     <w:p>
@@ -43,7 +43,7 @@
           <w:color w:val="1F4D78"/>
           <w:sz w:val="28"/>
         </w:rPr>
-        <w:t>从领导命令到个人执行、验收、审批与复盘的完整闭环</w:t>
+        <w:t>从目标到执行、验收、审批与复盘的真实业务闭环</w:t>
       </w:r>
     </w:p>
     <w:p>
@@ -109,7 +109,7 @@
                 <w:color w:val="1F4D78"/>
                 <w:sz w:val="21"/>
               </w:rPr>
-              <w:t>系统地址</w:t>
+              <w:t>环境</w:t>
             </w:r>
           </w:p>
         </w:tc>
@@ -135,7 +135,7 @@
                 <w:color w:val="0B2545"/>
                 <w:sz w:val="21"/>
               </w:rPr>
-              <w:t>http://localhost:3007</w:t>
+              <w:t>独立 Staging 验收后开放内部试用</w:t>
             </w:r>
           </w:p>
         </w:tc>
@@ -193,7 +193,7 @@
                 <w:color w:val="0B2545"/>
                 <w:sz w:val="21"/>
               </w:rPr>
-              <w:t>本地浏览器持久化（业务记录 + 上传文件）</w:t>
+              <w:t>Supabase PostgreSQL + RLS + Storage</w:t>
             </w:r>
           </w:p>
         </w:tc>
@@ -225,7 +225,7 @@
                 <w:color w:val="1F4D78"/>
                 <w:sz w:val="21"/>
               </w:rPr>
-              <w:t>交付日期</w:t>
+              <w:t>版本日期</w:t>
             </w:r>
           </w:p>
         </w:tc>
@@ -251,7 +251,7 @@
                 <w:color w:val="0B2545"/>
                 <w:sz w:val="21"/>
               </w:rPr>
-              <w:t>2026 年 8 月 9 日</w:t>
+              <w:t>2026 年 8 月 30 日</w:t>
             </w:r>
           </w:p>
         </w:tc>
@@ -389,7 +389,7 @@
                 <w:color w:val="1F4D78"/>
                 <w:sz w:val="20"/>
               </w:rPr>
-              <w:t>试用身份</w:t>
+              <w:t>岗位类型</w:t>
             </w:r>
           </w:p>
         </w:tc>
@@ -501,7 +501,7 @@
                 <w:color w:val="0B2545"/>
                 <w:sz w:val="19"/>
               </w:rPr>
-              <w:t>李总</w:t>
+              <w:t>管理层</w:t>
             </w:r>
           </w:p>
         </w:tc>
@@ -611,7 +611,7 @@
                 <w:color w:val="0B2545"/>
                 <w:sz w:val="19"/>
               </w:rPr>
-              <w:t>张伟</w:t>
+              <w:t>业务负责人</w:t>
             </w:r>
           </w:p>
         </w:tc>
@@ -692,7 +692,7 @@
                 <w:color w:val="0B2545"/>
                 <w:sz w:val="19"/>
               </w:rPr>
-              <w:t>承接目标、调度资源、验收成果、团队审批</w:t>
+              <w:t>承接目标、调度资源、验收成果、业务审批</w:t>
             </w:r>
           </w:p>
         </w:tc>
@@ -723,7 +723,7 @@
                 <w:color w:val="0B2545"/>
                 <w:sz w:val="19"/>
               </w:rPr>
-              <w:t>陈晨</w:t>
+              <w:t>执行成员</w:t>
             </w:r>
           </w:p>
         </w:tc>
@@ -833,7 +833,7 @@
                 <w:color w:val="0B2545"/>
                 <w:sz w:val="19"/>
               </w:rPr>
-              <w:t>周倩</w:t>
+              <w:t>财务人员</w:t>
             </w:r>
           </w:p>
         </w:tc>
@@ -887,7 +887,7 @@
                 <w:color w:val="0B2545"/>
                 <w:sz w:val="19"/>
               </w:rPr>
-              <w:t>财务工作台</w:t>
+              <w:t>财务执行中心</w:t>
             </w:r>
           </w:p>
         </w:tc>
@@ -914,7 +914,7 @@
                 <w:color w:val="0B2545"/>
                 <w:sz w:val="19"/>
               </w:rPr>
-              <w:t>预算协同、薪资核算与发放</w:t>
+              <w:t>费用审批、薪资核对与发放</w:t>
             </w:r>
           </w:p>
         </w:tc>
@@ -945,7 +945,7 @@
                 <w:color w:val="0B2545"/>
                 <w:sz w:val="19"/>
               </w:rPr>
-              <w:t>李琪</w:t>
+              <w:t>人事人员</w:t>
             </w:r>
           </w:p>
         </w:tc>
@@ -997,7 +997,7 @@
                 <w:color w:val="0B2545"/>
                 <w:sz w:val="19"/>
               </w:rPr>
-              <w:t>人事工作台</w:t>
+              <w:t>组织人事</w:t>
             </w:r>
           </w:p>
         </w:tc>
@@ -1023,7 +1023,7 @@
                 <w:color w:val="0B2545"/>
                 <w:sz w:val="19"/>
               </w:rPr>
-              <w:t>人员支持、考勤封账、薪资复核</w:t>
+              <w:t>人员档案、职级政策、薪资复核</w:t>
             </w:r>
           </w:p>
         </w:tc>
@@ -1139,7 +1139,7 @@
         <w:pageBreakBefore/>
       </w:pPr>
       <w:r>
-        <w:t>2. 启动、登录与角色切换</w:t>
+        <w:t>2. 登录与岗位权限</w:t>
       </w:r>
     </w:p>
     <w:p>
@@ -1154,7 +1154,7 @@
           <w:color w:val="0B2545"/>
           <w:sz w:val="22"/>
         </w:rPr>
-        <w:t>在项目目录依次执行以下命令：</w:t>
+        <w:t>通过企业统一登录入口进入系统。服务端根据组织、部门、职级、角色和权限码生成工作会话。</w:t>
       </w:r>
     </w:p>
     <w:tbl>
@@ -1203,7 +1203,7 @@
                 <w:color w:val="1F4D78"/>
                 <w:sz w:val="22"/>
               </w:rPr>
-              <w:t>启动命令</w:t>
+              <w:t>访问控制</w:t>
             </w:r>
           </w:p>
           <w:p>
@@ -1216,9 +1216,7 @@
                 <w:color w:val="0B2545"/>
                 <w:sz w:val="21"/>
               </w:rPr>
-              <w:t>npm install</w:t>
-              <w:br/>
-              <w:t>npm run dev -- -p 3007</w:t>
+              <w:t>导航只显示当前身份有权使用且已通过商业就绪门禁的模块；直接访问越权地址会由服务端拒绝。</w:t>
             </w:r>
           </w:p>
         </w:tc>
@@ -1241,7 +1239,7 @@
           <w:color w:val="0B2545"/>
           <w:sz w:val="22"/>
         </w:rPr>
-        <w:t>浏览器打开 http://localhost:3007。点击右上角用户菜单，可切换五类试用身份。</w:t>
+        <w:t>退出后服务端会话失效，PWA 静态缓存同时清理。</w:t>
       </w:r>
     </w:p>
     <w:tbl>
@@ -1303,7 +1301,7 @@
                 <w:color w:val="0B2545"/>
                 <w:sz w:val="21"/>
               </w:rPr>
-              <w:t>当前身份切换用于本地流程验收。面向真实企业部署时，应接入统一身份认证或 Supabase Auth，并将业务数据与文件迁移到服务端。</w:t>
+              <w:t>内部试用前必须在独立 Staging 环境完成真实身份、数据库迁移、RLS、对象存储、桌面端和移动端验收。</w:t>
             </w:r>
           </w:p>
         </w:tc>
@@ -1501,7 +1499,7 @@
         <w:pStyle w:val="ListNumber"/>
       </w:pPr>
       <w:r>
-        <w:t>在请假或考勤页面处理团队审批。</w:t>
+        <w:t>在审批中心处理当前权限范围内的业务申请。</w:t>
       </w:r>
     </w:p>
     <w:tbl>
@@ -1725,7 +1723,7 @@
         <w:pStyle w:val="Heading2"/>
       </w:pPr>
       <w:r>
-        <w:t>5.2 考勤与个人事项</w:t>
+        <w:t>5.2 个人业务</w:t>
       </w:r>
     </w:p>
     <w:p>
@@ -1733,7 +1731,7 @@
         <w:pStyle w:val="ListBullet"/>
       </w:pPr>
       <w:r>
-        <w:t>考勤管理：签到、签退、补卡和加班申请。</w:t>
+        <w:t>审批中心：发起并跟踪报销、采购与合同流程。</w:t>
       </w:r>
     </w:p>
     <w:p>
@@ -1741,7 +1739,7 @@
         <w:pStyle w:val="ListBullet"/>
       </w:pPr>
       <w:r>
-        <w:t>请假管理：提交请假并查看负责人、人事处理状态。</w:t>
+        <w:t>通知中心：处理任务、审批和业务异常提醒。</w:t>
       </w:r>
     </w:p>
     <w:p>
@@ -1781,7 +1779,7 @@
         <w:pStyle w:val="ListNumber"/>
       </w:pPr>
       <w:r>
-        <w:t>人事完成考勤封账后执行薪资核算。</w:t>
+        <w:t>核对工资政策、奖金、扣减和工资单范围。</w:t>
       </w:r>
     </w:p>
     <w:p>
@@ -1854,7 +1852,7 @@
                 <w:color w:val="1F4D78"/>
                 <w:sz w:val="22"/>
               </w:rPr>
-              <w:t>薪资顺序</w:t>
+              <w:t>薪资原则</w:t>
             </w:r>
           </w:p>
           <w:p>
@@ -1867,7 +1865,7 @@
                 <w:color w:val="0B2545"/>
                 <w:sz w:val="21"/>
               </w:rPr>
-              <w:t>考勤封账 → 财务核算 → 人事复核 → 领导批准 → 财务发放。系统不允许跳步。</w:t>
+              <w:t>工资数据确认 → 财务核算 → 人事复核 → 授权批准 → 财务发放。所有状态来自服务端记录。</w:t>
             </w:r>
           </w:p>
         </w:tc>
@@ -1907,7 +1905,7 @@
         <w:pStyle w:val="ListNumber"/>
       </w:pPr>
       <w:r>
-        <w:t>维护组织档案、人员标签和考勤制度。</w:t>
+        <w:t>维护组织档案、部门、职级和汇报关系。</w:t>
       </w:r>
     </w:p>
     <w:p>
@@ -1919,7 +1917,7 @@
         <w:pStyle w:val="ListNumber"/>
       </w:pPr>
       <w:r>
-        <w:t>复核请假、补卡和加班。</w:t>
+        <w:t>配置部门与职级对应的薪资政策。</w:t>
       </w:r>
     </w:p>
     <w:p>
@@ -1931,7 +1929,7 @@
         <w:pStyle w:val="ListNumber"/>
       </w:pPr>
       <w:r>
-        <w:t>处理考勤异常，完成月度封账。</w:t>
+        <w:t>复核员工范围、工资政策和计算结果。</w:t>
       </w:r>
     </w:p>
     <w:p>
@@ -1943,7 +1941,7 @@
         <w:pStyle w:val="ListNumber"/>
       </w:pPr>
       <w:r>
-        <w:t>复核薪资人员和考勤数据。</w:t>
+        <w:t>处理人员状态变更并保留审计记录。</w:t>
       </w:r>
     </w:p>
     <w:p>
@@ -2132,7 +2130,7 @@
           <w:color w:val="0B2545"/>
           <w:sz w:val="22"/>
         </w:rPr>
-        <w:t>客户管理支持新建客户、筛选、查看档案、记录跟进并推进客户阶段。客户资料保存在当前浏览器，刷新后仍然存在。</w:t>
+        <w:t>客户管理支持新建客户、筛选、查看档案、记录跟进并推进客户阶段。客户资料由服务端保存，并按租户和权限隔离。</w:t>
       </w:r>
     </w:p>
     <w:p>
@@ -2225,7 +2223,7 @@
           <w:color w:val="0B2545"/>
           <w:sz w:val="22"/>
         </w:rPr>
-        <w:t>本地交付版把业务记录保存在 localStorage，上传文件保存在 IndexedDB。普通刷新不会清除；清理浏览器站点数据、更换浏览器或更换电脑会导致本地数据不可用。</w:t>
+        <w:t>正式业务记录保存在 Supabase PostgreSQL，文件保存在 Supabase Storage，并由 RLS、对象权限和服务端审计保护。浏览器不作为正式业务数据库。</w:t>
       </w:r>
     </w:p>
     <w:p>
@@ -2376,7 +2374,7 @@
           <w:color w:val="0B2545"/>
           <w:sz w:val="22"/>
         </w:rPr>
-        <w:t>人事必须先处理所有考勤异常并完成考勤封账。</w:t>
+        <w:t>检查当前账号权限、有效薪资政策、工资周期和员工范围是否完整。</w:t>
       </w:r>
     </w:p>
     <w:p>
@@ -2407,7 +2405,7 @@
         <w:pStyle w:val="Heading3"/>
       </w:pPr>
       <w:r>
-        <w:t>示例文件为什么不能下载？</w:t>
+        <w:t>文件为什么不能下载？</w:t>
       </w:r>
     </w:p>
     <w:p>
@@ -2422,7 +2420,7 @@
           <w:color w:val="0B2545"/>
           <w:sz w:val="22"/>
         </w:rPr>
-        <w:t>内置示例记录只有文件元数据；用户自己上传的文件包含真实内容，可以下载。</w:t>
+        <w:t>检查文件处理状态、对象存储权限、记录归属和当前会话；失败时保留错误码用于追踪。</w:t>
       </w:r>
     </w:p>
     <w:p>
@@ -2442,7 +2440,7 @@
         <w:pStyle w:val="ListNumber"/>
       </w:pPr>
       <w:r>
-        <w:t>李总下达命令并确认下发。</w:t>
+        <w:t>决策人下达目标并确认下发。</w:t>
       </w:r>
     </w:p>
     <w:p>
@@ -2454,7 +2452,7 @@
         <w:pStyle w:val="ListNumber"/>
       </w:pPr>
       <w:r>
-        <w:t>陈晨开始任务、上传成果并提交验收。</w:t>
+        <w:t>执行人开始任务、上传成果并提交验收。</w:t>
       </w:r>
     </w:p>
     <w:p>
@@ -2466,7 +2464,7 @@
         <w:pStyle w:val="ListNumber"/>
       </w:pPr>
       <w:r>
-        <w:t>张伟完成验收或退回修改。</w:t>
+        <w:t>负责人完成验收或退回修改。</w:t>
       </w:r>
     </w:p>
     <w:p>
@@ -2490,7 +2488,7 @@
         <w:pStyle w:val="ListNumber"/>
       </w:pPr>
       <w:r>
-        <w:t>员工提交请假、补卡和加班，负责人和人事逐级审批。</w:t>
+        <w:t>员工发起报销，审批人完成通过、退回和再次提交。</w:t>
       </w:r>
     </w:p>
     <w:p>
@@ -2502,7 +2500,7 @@
         <w:pStyle w:val="ListNumber"/>
       </w:pPr>
       <w:r>
-        <w:t>人事处理异常并完成考勤封账。</w:t>
+        <w:t>人事核对组织、职级和薪资政策。</w:t>
       </w:r>
     </w:p>
     <w:p>
@@ -2526,7 +2524,7 @@
         <w:pStyle w:val="ListNumber"/>
       </w:pPr>
       <w:r>
-        <w:t>李总查看通知和周报，完成总验收并归档。</w:t>
+        <w:t>决策人查看通知和周报，完成总验收并归档。</w:t>
       </w:r>
     </w:p>
     <w:tbl>

</xml_diff>